<commit_message>
bo sung bai tap
</commit_message>
<xml_diff>
--- a/LeNguyenQuynh_22657871.docx
+++ b/LeNguyenQuynh_22657871.docx
@@ -748,8 +748,1512 @@
           <w:szCs w:val="26"/>
         </w:rPr>
       </w:pPr>
+      <w:r>
+        <w:rPr>
+          <w:rFonts w:ascii="Times New Roman" w:hAnsi="Times New Roman" w:cs="Times New Roman"/>
+          <w:sz w:val="26"/>
+          <w:szCs w:val="26"/>
+        </w:rPr>
+        <w:t xml:space="preserve">Docker exec –it </w:t>
+      </w:r>
+      <w:r>
+        <w:rPr>
+          <w:rFonts w:ascii="Times New Roman" w:hAnsi="Times New Roman" w:cs="Times New Roman"/>
+          <w:sz w:val="26"/>
+          <w:szCs w:val="26"/>
+        </w:rPr>
+        <w:t>&lt;container</w:t>
+      </w:r>
+      <w:r>
+        <w:rPr>
+          <w:rFonts w:ascii="Times New Roman" w:hAnsi="Times New Roman" w:cs="Times New Roman"/>
+          <w:sz w:val="26"/>
+          <w:szCs w:val="26"/>
+        </w:rPr>
+        <w:t>_id&gt;</w:t>
+      </w:r>
+    </w:p>
+    <w:p>
+      <w:pPr>
+        <w:rPr>
+          <w:rFonts w:ascii="Times New Roman" w:hAnsi="Times New Roman" w:cs="Times New Roman"/>
+          <w:sz w:val="26"/>
+          <w:szCs w:val="26"/>
+        </w:rPr>
+      </w:pPr>
+      <w:r>
+        <w:rPr>
+          <w:rFonts w:ascii="Times New Roman" w:hAnsi="Times New Roman" w:cs="Times New Roman"/>
+          <w:noProof/>
+          <w:sz w:val="26"/>
+          <w:szCs w:val="26"/>
+        </w:rPr>
+        <w:lastRenderedPageBreak/>
+        <w:drawing>
+          <wp:inline distT="0" distB="0" distL="0" distR="0">
+            <wp:extent cx="5943600" cy="1798320"/>
+            <wp:effectExtent l="0" t="0" r="0" b="0"/>
+            <wp:docPr id="9" name="Picture 9"/>
+            <wp:cNvGraphicFramePr>
+              <a:graphicFrameLocks xmlns:a="http://schemas.openxmlformats.org/drawingml/2006/main" noChangeAspect="1"/>
+            </wp:cNvGraphicFramePr>
+            <a:graphic xmlns:a="http://schemas.openxmlformats.org/drawingml/2006/main">
+              <a:graphicData uri="http://schemas.openxmlformats.org/drawingml/2006/picture">
+                <pic:pic xmlns:pic="http://schemas.openxmlformats.org/drawingml/2006/picture">
+                  <pic:nvPicPr>
+                    <pic:cNvPr id="9" name="91CA9FC.tmp"/>
+                    <pic:cNvPicPr/>
+                  </pic:nvPicPr>
+                  <pic:blipFill>
+                    <a:blip r:embed="rId12">
+                      <a:extLst>
+                        <a:ext uri="{28A0092B-C50C-407E-A947-70E740481C1C}">
+                          <a14:useLocalDpi xmlns:a14="http://schemas.microsoft.com/office/drawing/2010/main" val="0"/>
+                        </a:ext>
+                      </a:extLst>
+                    </a:blip>
+                    <a:stretch>
+                      <a:fillRect/>
+                    </a:stretch>
+                  </pic:blipFill>
+                  <pic:spPr>
+                    <a:xfrm>
+                      <a:off x="0" y="0"/>
+                      <a:ext cx="5943600" cy="1798320"/>
+                    </a:xfrm>
+                    <a:prstGeom prst="rect">
+                      <a:avLst/>
+                    </a:prstGeom>
+                  </pic:spPr>
+                </pic:pic>
+              </a:graphicData>
+            </a:graphic>
+          </wp:inline>
+        </w:drawing>
+      </w:r>
+    </w:p>
+    <w:p>
+      <w:pPr>
+        <w:rPr>
+          <w:rFonts w:ascii="Times New Roman" w:hAnsi="Times New Roman" w:cs="Times New Roman"/>
+          <w:sz w:val="26"/>
+          <w:szCs w:val="26"/>
+        </w:rPr>
+      </w:pPr>
+      <w:proofErr w:type="gramStart"/>
+      <w:r>
+        <w:rPr>
+          <w:rFonts w:ascii="Times New Roman" w:hAnsi="Times New Roman" w:cs="Times New Roman"/>
+          <w:sz w:val="26"/>
+          <w:szCs w:val="26"/>
+        </w:rPr>
+        <w:t>docker</w:t>
+      </w:r>
+      <w:proofErr w:type="gramEnd"/>
+      <w:r>
+        <w:rPr>
+          <w:rFonts w:ascii="Times New Roman" w:hAnsi="Times New Roman" w:cs="Times New Roman"/>
+          <w:sz w:val="26"/>
+          <w:szCs w:val="26"/>
+        </w:rPr>
+        <w:t xml:space="preserve"> restart &lt;container_id&gt;</w:t>
+      </w:r>
+    </w:p>
+    <w:p>
+      <w:pPr>
+        <w:rPr>
+          <w:rFonts w:ascii="Times New Roman" w:hAnsi="Times New Roman" w:cs="Times New Roman"/>
+          <w:sz w:val="26"/>
+          <w:szCs w:val="26"/>
+        </w:rPr>
+      </w:pPr>
+      <w:r>
+        <w:rPr>
+          <w:rFonts w:ascii="Times New Roman" w:hAnsi="Times New Roman" w:cs="Times New Roman"/>
+          <w:noProof/>
+          <w:sz w:val="26"/>
+          <w:szCs w:val="26"/>
+        </w:rPr>
+        <w:drawing>
+          <wp:inline distT="0" distB="0" distL="0" distR="0">
+            <wp:extent cx="5943600" cy="738505"/>
+            <wp:effectExtent l="0" t="0" r="0" b="4445"/>
+            <wp:docPr id="11" name="Picture 11"/>
+            <wp:cNvGraphicFramePr>
+              <a:graphicFrameLocks xmlns:a="http://schemas.openxmlformats.org/drawingml/2006/main" noChangeAspect="1"/>
+            </wp:cNvGraphicFramePr>
+            <a:graphic xmlns:a="http://schemas.openxmlformats.org/drawingml/2006/main">
+              <a:graphicData uri="http://schemas.openxmlformats.org/drawingml/2006/picture">
+                <pic:pic xmlns:pic="http://schemas.openxmlformats.org/drawingml/2006/picture">
+                  <pic:nvPicPr>
+                    <pic:cNvPr id="11" name="91C3FEB.tmp"/>
+                    <pic:cNvPicPr/>
+                  </pic:nvPicPr>
+                  <pic:blipFill>
+                    <a:blip r:embed="rId13">
+                      <a:extLst>
+                        <a:ext uri="{28A0092B-C50C-407E-A947-70E740481C1C}">
+                          <a14:useLocalDpi xmlns:a14="http://schemas.microsoft.com/office/drawing/2010/main" val="0"/>
+                        </a:ext>
+                      </a:extLst>
+                    </a:blip>
+                    <a:stretch>
+                      <a:fillRect/>
+                    </a:stretch>
+                  </pic:blipFill>
+                  <pic:spPr>
+                    <a:xfrm>
+                      <a:off x="0" y="0"/>
+                      <a:ext cx="5943600" cy="738505"/>
+                    </a:xfrm>
+                    <a:prstGeom prst="rect">
+                      <a:avLst/>
+                    </a:prstGeom>
+                  </pic:spPr>
+                </pic:pic>
+              </a:graphicData>
+            </a:graphic>
+          </wp:inline>
+        </w:drawing>
+      </w:r>
+    </w:p>
+    <w:p>
+      <w:pPr>
+        <w:rPr>
+          <w:rFonts w:ascii="Times New Roman" w:hAnsi="Times New Roman" w:cs="Times New Roman"/>
+          <w:sz w:val="26"/>
+          <w:szCs w:val="26"/>
+        </w:rPr>
+      </w:pPr>
+      <w:proofErr w:type="gramStart"/>
+      <w:r>
+        <w:rPr>
+          <w:rFonts w:ascii="Times New Roman" w:hAnsi="Times New Roman" w:cs="Times New Roman"/>
+          <w:sz w:val="26"/>
+          <w:szCs w:val="26"/>
+        </w:rPr>
+        <w:t>docker</w:t>
+      </w:r>
+      <w:proofErr w:type="gramEnd"/>
+      <w:r>
+        <w:rPr>
+          <w:rFonts w:ascii="Times New Roman" w:hAnsi="Times New Roman" w:cs="Times New Roman"/>
+          <w:sz w:val="26"/>
+          <w:szCs w:val="26"/>
+        </w:rPr>
+        <w:t xml:space="preserve"> rm &lt;container_id&gt;</w:t>
+      </w:r>
+    </w:p>
+    <w:p>
+      <w:pPr>
+        <w:rPr>
+          <w:rFonts w:ascii="Times New Roman" w:hAnsi="Times New Roman" w:cs="Times New Roman"/>
+          <w:sz w:val="26"/>
+          <w:szCs w:val="26"/>
+        </w:rPr>
+      </w:pPr>
+      <w:r>
+        <w:rPr>
+          <w:rFonts w:ascii="Times New Roman" w:hAnsi="Times New Roman" w:cs="Times New Roman"/>
+          <w:noProof/>
+          <w:sz w:val="26"/>
+          <w:szCs w:val="26"/>
+        </w:rPr>
+        <w:drawing>
+          <wp:inline distT="0" distB="0" distL="0" distR="0">
+            <wp:extent cx="5943600" cy="1194435"/>
+            <wp:effectExtent l="0" t="0" r="0" b="5715"/>
+            <wp:docPr id="12" name="Picture 12"/>
+            <wp:cNvGraphicFramePr>
+              <a:graphicFrameLocks xmlns:a="http://schemas.openxmlformats.org/drawingml/2006/main" noChangeAspect="1"/>
+            </wp:cNvGraphicFramePr>
+            <a:graphic xmlns:a="http://schemas.openxmlformats.org/drawingml/2006/main">
+              <a:graphicData uri="http://schemas.openxmlformats.org/drawingml/2006/picture">
+                <pic:pic xmlns:pic="http://schemas.openxmlformats.org/drawingml/2006/picture">
+                  <pic:nvPicPr>
+                    <pic:cNvPr id="12" name="91C3B8D.tmp"/>
+                    <pic:cNvPicPr/>
+                  </pic:nvPicPr>
+                  <pic:blipFill>
+                    <a:blip r:embed="rId14">
+                      <a:extLst>
+                        <a:ext uri="{28A0092B-C50C-407E-A947-70E740481C1C}">
+                          <a14:useLocalDpi xmlns:a14="http://schemas.microsoft.com/office/drawing/2010/main" val="0"/>
+                        </a:ext>
+                      </a:extLst>
+                    </a:blip>
+                    <a:stretch>
+                      <a:fillRect/>
+                    </a:stretch>
+                  </pic:blipFill>
+                  <pic:spPr>
+                    <a:xfrm>
+                      <a:off x="0" y="0"/>
+                      <a:ext cx="5943600" cy="1194435"/>
+                    </a:xfrm>
+                    <a:prstGeom prst="rect">
+                      <a:avLst/>
+                    </a:prstGeom>
+                  </pic:spPr>
+                </pic:pic>
+              </a:graphicData>
+            </a:graphic>
+          </wp:inline>
+        </w:drawing>
+      </w:r>
+    </w:p>
+    <w:p>
+      <w:pPr>
+        <w:rPr>
+          <w:rFonts w:ascii="Times New Roman" w:hAnsi="Times New Roman" w:cs="Times New Roman"/>
+          <w:sz w:val="26"/>
+          <w:szCs w:val="26"/>
+        </w:rPr>
+      </w:pPr>
+      <w:proofErr w:type="gramStart"/>
+      <w:r>
+        <w:rPr>
+          <w:rFonts w:ascii="Times New Roman" w:hAnsi="Times New Roman" w:cs="Times New Roman"/>
+          <w:sz w:val="26"/>
+          <w:szCs w:val="26"/>
+        </w:rPr>
+        <w:t>docker</w:t>
+      </w:r>
+      <w:proofErr w:type="gramEnd"/>
+      <w:r>
+        <w:rPr>
+          <w:rFonts w:ascii="Times New Roman" w:hAnsi="Times New Roman" w:cs="Times New Roman"/>
+          <w:sz w:val="26"/>
+          <w:szCs w:val="26"/>
+        </w:rPr>
+        <w:t xml:space="preserve"> rmi &lt;image_id&gt;</w:t>
+      </w:r>
+    </w:p>
+    <w:p>
+      <w:pPr>
+        <w:rPr>
+          <w:rFonts w:ascii="Times New Roman" w:hAnsi="Times New Roman" w:cs="Times New Roman"/>
+          <w:sz w:val="26"/>
+          <w:szCs w:val="26"/>
+        </w:rPr>
+      </w:pPr>
+      <w:r>
+        <w:rPr>
+          <w:rFonts w:ascii="Times New Roman" w:hAnsi="Times New Roman" w:cs="Times New Roman"/>
+          <w:noProof/>
+          <w:sz w:val="26"/>
+          <w:szCs w:val="26"/>
+        </w:rPr>
+        <w:drawing>
+          <wp:inline distT="0" distB="0" distL="0" distR="0">
+            <wp:extent cx="5943600" cy="1232535"/>
+            <wp:effectExtent l="0" t="0" r="0" b="5715"/>
+            <wp:docPr id="13" name="Picture 13"/>
+            <wp:cNvGraphicFramePr>
+              <a:graphicFrameLocks xmlns:a="http://schemas.openxmlformats.org/drawingml/2006/main" noChangeAspect="1"/>
+            </wp:cNvGraphicFramePr>
+            <a:graphic xmlns:a="http://schemas.openxmlformats.org/drawingml/2006/main">
+              <a:graphicData uri="http://schemas.openxmlformats.org/drawingml/2006/picture">
+                <pic:pic xmlns:pic="http://schemas.openxmlformats.org/drawingml/2006/picture">
+                  <pic:nvPicPr>
+                    <pic:cNvPr id="13" name="91CE12B.tmp"/>
+                    <pic:cNvPicPr/>
+                  </pic:nvPicPr>
+                  <pic:blipFill>
+                    <a:blip r:embed="rId15">
+                      <a:extLst>
+                        <a:ext uri="{28A0092B-C50C-407E-A947-70E740481C1C}">
+                          <a14:useLocalDpi xmlns:a14="http://schemas.microsoft.com/office/drawing/2010/main" val="0"/>
+                        </a:ext>
+                      </a:extLst>
+                    </a:blip>
+                    <a:stretch>
+                      <a:fillRect/>
+                    </a:stretch>
+                  </pic:blipFill>
+                  <pic:spPr>
+                    <a:xfrm>
+                      <a:off x="0" y="0"/>
+                      <a:ext cx="5943600" cy="1232535"/>
+                    </a:xfrm>
+                    <a:prstGeom prst="rect">
+                      <a:avLst/>
+                    </a:prstGeom>
+                  </pic:spPr>
+                </pic:pic>
+              </a:graphicData>
+            </a:graphic>
+          </wp:inline>
+        </w:drawing>
+      </w:r>
+    </w:p>
+    <w:p>
+      <w:pPr>
+        <w:rPr>
+          <w:rFonts w:ascii="Times New Roman" w:hAnsi="Times New Roman" w:cs="Times New Roman"/>
+          <w:sz w:val="26"/>
+          <w:szCs w:val="26"/>
+        </w:rPr>
+      </w:pPr>
+      <w:proofErr w:type="gramStart"/>
+      <w:r>
+        <w:rPr>
+          <w:rFonts w:ascii="Times New Roman" w:hAnsi="Times New Roman" w:cs="Times New Roman"/>
+          <w:sz w:val="26"/>
+          <w:szCs w:val="26"/>
+        </w:rPr>
+        <w:t>docker</w:t>
+      </w:r>
+      <w:proofErr w:type="gramEnd"/>
+      <w:r>
+        <w:rPr>
+          <w:rFonts w:ascii="Times New Roman" w:hAnsi="Times New Roman" w:cs="Times New Roman"/>
+          <w:sz w:val="26"/>
+          <w:szCs w:val="26"/>
+        </w:rPr>
+        <w:t xml:space="preserve"> run -d -p 8080:80 nginx</w:t>
+      </w:r>
+    </w:p>
+    <w:p>
+      <w:pPr>
+        <w:rPr>
+          <w:rFonts w:ascii="Times New Roman" w:hAnsi="Times New Roman" w:cs="Times New Roman"/>
+          <w:sz w:val="26"/>
+          <w:szCs w:val="26"/>
+        </w:rPr>
+      </w:pPr>
+      <w:r>
+        <w:rPr>
+          <w:rFonts w:ascii="Times New Roman" w:hAnsi="Times New Roman" w:cs="Times New Roman"/>
+          <w:noProof/>
+          <w:sz w:val="26"/>
+          <w:szCs w:val="26"/>
+        </w:rPr>
+        <w:drawing>
+          <wp:inline distT="0" distB="0" distL="0" distR="0">
+            <wp:extent cx="5943600" cy="911225"/>
+            <wp:effectExtent l="0" t="0" r="0" b="3175"/>
+            <wp:docPr id="14" name="Picture 14"/>
+            <wp:cNvGraphicFramePr>
+              <a:graphicFrameLocks xmlns:a="http://schemas.openxmlformats.org/drawingml/2006/main" noChangeAspect="1"/>
+            </wp:cNvGraphicFramePr>
+            <a:graphic xmlns:a="http://schemas.openxmlformats.org/drawingml/2006/main">
+              <a:graphicData uri="http://schemas.openxmlformats.org/drawingml/2006/picture">
+                <pic:pic xmlns:pic="http://schemas.openxmlformats.org/drawingml/2006/picture">
+                  <pic:nvPicPr>
+                    <pic:cNvPr id="14" name="91CD98C.tmp"/>
+                    <pic:cNvPicPr/>
+                  </pic:nvPicPr>
+                  <pic:blipFill>
+                    <a:blip r:embed="rId16">
+                      <a:extLst>
+                        <a:ext uri="{28A0092B-C50C-407E-A947-70E740481C1C}">
+                          <a14:useLocalDpi xmlns:a14="http://schemas.microsoft.com/office/drawing/2010/main" val="0"/>
+                        </a:ext>
+                      </a:extLst>
+                    </a:blip>
+                    <a:stretch>
+                      <a:fillRect/>
+                    </a:stretch>
+                  </pic:blipFill>
+                  <pic:spPr>
+                    <a:xfrm>
+                      <a:off x="0" y="0"/>
+                      <a:ext cx="5943600" cy="911225"/>
+                    </a:xfrm>
+                    <a:prstGeom prst="rect">
+                      <a:avLst/>
+                    </a:prstGeom>
+                  </pic:spPr>
+                </pic:pic>
+              </a:graphicData>
+            </a:graphic>
+          </wp:inline>
+        </w:drawing>
+      </w:r>
+    </w:p>
+    <w:p>
+      <w:pPr>
+        <w:rPr>
+          <w:rFonts w:ascii="Times New Roman" w:hAnsi="Times New Roman" w:cs="Times New Roman"/>
+          <w:sz w:val="26"/>
+          <w:szCs w:val="26"/>
+        </w:rPr>
+      </w:pPr>
+      <w:proofErr w:type="gramStart"/>
+      <w:r>
+        <w:rPr>
+          <w:rFonts w:ascii="Times New Roman" w:hAnsi="Times New Roman" w:cs="Times New Roman"/>
+          <w:sz w:val="26"/>
+          <w:szCs w:val="26"/>
+        </w:rPr>
+        <w:t>docker</w:t>
+      </w:r>
+      <w:proofErr w:type="gramEnd"/>
+      <w:r>
+        <w:rPr>
+          <w:rFonts w:ascii="Times New Roman" w:hAnsi="Times New Roman" w:cs="Times New Roman"/>
+          <w:sz w:val="26"/>
+          <w:szCs w:val="26"/>
+        </w:rPr>
+        <w:t xml:space="preserve"> inspect &lt;container_id&gt;</w:t>
+      </w:r>
+    </w:p>
+    <w:p>
+      <w:pPr>
+        <w:rPr>
+          <w:rFonts w:ascii="Times New Roman" w:hAnsi="Times New Roman" w:cs="Times New Roman"/>
+          <w:sz w:val="26"/>
+          <w:szCs w:val="26"/>
+        </w:rPr>
+      </w:pPr>
+      <w:r>
+        <w:rPr>
+          <w:rFonts w:ascii="Times New Roman" w:hAnsi="Times New Roman" w:cs="Times New Roman"/>
+          <w:noProof/>
+          <w:sz w:val="26"/>
+          <w:szCs w:val="26"/>
+        </w:rPr>
+        <w:lastRenderedPageBreak/>
+        <w:drawing>
+          <wp:inline distT="0" distB="0" distL="0" distR="0">
+            <wp:extent cx="5943600" cy="3456940"/>
+            <wp:effectExtent l="0" t="0" r="0" b="0"/>
+            <wp:docPr id="15" name="Picture 15"/>
+            <wp:cNvGraphicFramePr>
+              <a:graphicFrameLocks xmlns:a="http://schemas.openxmlformats.org/drawingml/2006/main" noChangeAspect="1"/>
+            </wp:cNvGraphicFramePr>
+            <a:graphic xmlns:a="http://schemas.openxmlformats.org/drawingml/2006/main">
+              <a:graphicData uri="http://schemas.openxmlformats.org/drawingml/2006/picture">
+                <pic:pic xmlns:pic="http://schemas.openxmlformats.org/drawingml/2006/picture">
+                  <pic:nvPicPr>
+                    <pic:cNvPr id="15" name="91CB5F3.tmp"/>
+                    <pic:cNvPicPr/>
+                  </pic:nvPicPr>
+                  <pic:blipFill>
+                    <a:blip r:embed="rId17">
+                      <a:extLst>
+                        <a:ext uri="{28A0092B-C50C-407E-A947-70E740481C1C}">
+                          <a14:useLocalDpi xmlns:a14="http://schemas.microsoft.com/office/drawing/2010/main" val="0"/>
+                        </a:ext>
+                      </a:extLst>
+                    </a:blip>
+                    <a:stretch>
+                      <a:fillRect/>
+                    </a:stretch>
+                  </pic:blipFill>
+                  <pic:spPr>
+                    <a:xfrm>
+                      <a:off x="0" y="0"/>
+                      <a:ext cx="5943600" cy="3456940"/>
+                    </a:xfrm>
+                    <a:prstGeom prst="rect">
+                      <a:avLst/>
+                    </a:prstGeom>
+                  </pic:spPr>
+                </pic:pic>
+              </a:graphicData>
+            </a:graphic>
+          </wp:inline>
+        </w:drawing>
+      </w:r>
+    </w:p>
+    <w:p>
+      <w:pPr>
+        <w:rPr>
+          <w:rFonts w:ascii="Times New Roman" w:hAnsi="Times New Roman" w:cs="Times New Roman"/>
+          <w:sz w:val="26"/>
+          <w:szCs w:val="26"/>
+        </w:rPr>
+      </w:pPr>
+      <w:proofErr w:type="gramStart"/>
+      <w:r>
+        <w:rPr>
+          <w:rFonts w:ascii="Times New Roman" w:hAnsi="Times New Roman" w:cs="Times New Roman"/>
+          <w:sz w:val="26"/>
+          <w:szCs w:val="26"/>
+        </w:rPr>
+        <w:t>docker</w:t>
+      </w:r>
+      <w:proofErr w:type="gramEnd"/>
+      <w:r>
+        <w:rPr>
+          <w:rFonts w:ascii="Times New Roman" w:hAnsi="Times New Roman" w:cs="Times New Roman"/>
+          <w:sz w:val="26"/>
+          <w:szCs w:val="26"/>
+        </w:rPr>
+        <w:t xml:space="preserve"> run -d -v mydata:/data nginx</w:t>
+      </w:r>
+    </w:p>
+    <w:p>
+      <w:pPr>
+        <w:rPr>
+          <w:rFonts w:ascii="Times New Roman" w:hAnsi="Times New Roman" w:cs="Times New Roman"/>
+          <w:sz w:val="26"/>
+          <w:szCs w:val="26"/>
+        </w:rPr>
+      </w:pPr>
+      <w:r>
+        <w:rPr>
+          <w:rFonts w:ascii="Times New Roman" w:hAnsi="Times New Roman" w:cs="Times New Roman"/>
+          <w:noProof/>
+          <w:sz w:val="26"/>
+          <w:szCs w:val="26"/>
+        </w:rPr>
+        <w:drawing>
+          <wp:inline distT="0" distB="0" distL="0" distR="0">
+            <wp:extent cx="5943600" cy="937260"/>
+            <wp:effectExtent l="0" t="0" r="0" b="0"/>
+            <wp:docPr id="16" name="Picture 16"/>
+            <wp:cNvGraphicFramePr>
+              <a:graphicFrameLocks xmlns:a="http://schemas.openxmlformats.org/drawingml/2006/main" noChangeAspect="1"/>
+            </wp:cNvGraphicFramePr>
+            <a:graphic xmlns:a="http://schemas.openxmlformats.org/drawingml/2006/main">
+              <a:graphicData uri="http://schemas.openxmlformats.org/drawingml/2006/picture">
+                <pic:pic xmlns:pic="http://schemas.openxmlformats.org/drawingml/2006/picture">
+                  <pic:nvPicPr>
+                    <pic:cNvPr id="16" name="91CB766.tmp"/>
+                    <pic:cNvPicPr/>
+                  </pic:nvPicPr>
+                  <pic:blipFill>
+                    <a:blip r:embed="rId18">
+                      <a:extLst>
+                        <a:ext uri="{28A0092B-C50C-407E-A947-70E740481C1C}">
+                          <a14:useLocalDpi xmlns:a14="http://schemas.microsoft.com/office/drawing/2010/main" val="0"/>
+                        </a:ext>
+                      </a:extLst>
+                    </a:blip>
+                    <a:stretch>
+                      <a:fillRect/>
+                    </a:stretch>
+                  </pic:blipFill>
+                  <pic:spPr>
+                    <a:xfrm>
+                      <a:off x="0" y="0"/>
+                      <a:ext cx="5943600" cy="937260"/>
+                    </a:xfrm>
+                    <a:prstGeom prst="rect">
+                      <a:avLst/>
+                    </a:prstGeom>
+                  </pic:spPr>
+                </pic:pic>
+              </a:graphicData>
+            </a:graphic>
+          </wp:inline>
+        </w:drawing>
+      </w:r>
+    </w:p>
+    <w:p>
+      <w:pPr>
+        <w:rPr>
+          <w:rFonts w:ascii="Times New Roman" w:hAnsi="Times New Roman" w:cs="Times New Roman"/>
+          <w:sz w:val="26"/>
+          <w:szCs w:val="26"/>
+        </w:rPr>
+      </w:pPr>
+      <w:proofErr w:type="gramStart"/>
+      <w:r>
+        <w:rPr>
+          <w:rFonts w:ascii="Times New Roman" w:hAnsi="Times New Roman" w:cs="Times New Roman"/>
+          <w:sz w:val="26"/>
+          <w:szCs w:val="26"/>
+        </w:rPr>
+        <w:t>docker</w:t>
+      </w:r>
+      <w:proofErr w:type="gramEnd"/>
+      <w:r>
+        <w:rPr>
+          <w:rFonts w:ascii="Times New Roman" w:hAnsi="Times New Roman" w:cs="Times New Roman"/>
+          <w:sz w:val="26"/>
+          <w:szCs w:val="26"/>
+        </w:rPr>
+        <w:t xml:space="preserve"> volume ls</w:t>
+      </w:r>
+    </w:p>
+    <w:p>
+      <w:pPr>
+        <w:rPr>
+          <w:rFonts w:ascii="Times New Roman" w:hAnsi="Times New Roman" w:cs="Times New Roman"/>
+          <w:sz w:val="26"/>
+          <w:szCs w:val="26"/>
+        </w:rPr>
+      </w:pPr>
+      <w:r>
+        <w:rPr>
+          <w:rFonts w:ascii="Times New Roman" w:hAnsi="Times New Roman" w:cs="Times New Roman"/>
+          <w:noProof/>
+          <w:sz w:val="26"/>
+          <w:szCs w:val="26"/>
+        </w:rPr>
+        <w:drawing>
+          <wp:inline distT="0" distB="0" distL="0" distR="0">
+            <wp:extent cx="5943600" cy="1270635"/>
+            <wp:effectExtent l="0" t="0" r="0" b="5715"/>
+            <wp:docPr id="17" name="Picture 17"/>
+            <wp:cNvGraphicFramePr>
+              <a:graphicFrameLocks xmlns:a="http://schemas.openxmlformats.org/drawingml/2006/main" noChangeAspect="1"/>
+            </wp:cNvGraphicFramePr>
+            <a:graphic xmlns:a="http://schemas.openxmlformats.org/drawingml/2006/main">
+              <a:graphicData uri="http://schemas.openxmlformats.org/drawingml/2006/picture">
+                <pic:pic xmlns:pic="http://schemas.openxmlformats.org/drawingml/2006/picture">
+                  <pic:nvPicPr>
+                    <pic:cNvPr id="17" name="91C2E9B.tmp"/>
+                    <pic:cNvPicPr/>
+                  </pic:nvPicPr>
+                  <pic:blipFill>
+                    <a:blip r:embed="rId19">
+                      <a:extLst>
+                        <a:ext uri="{28A0092B-C50C-407E-A947-70E740481C1C}">
+                          <a14:useLocalDpi xmlns:a14="http://schemas.microsoft.com/office/drawing/2010/main" val="0"/>
+                        </a:ext>
+                      </a:extLst>
+                    </a:blip>
+                    <a:stretch>
+                      <a:fillRect/>
+                    </a:stretch>
+                  </pic:blipFill>
+                  <pic:spPr>
+                    <a:xfrm>
+                      <a:off x="0" y="0"/>
+                      <a:ext cx="5943600" cy="1270635"/>
+                    </a:xfrm>
+                    <a:prstGeom prst="rect">
+                      <a:avLst/>
+                    </a:prstGeom>
+                  </pic:spPr>
+                </pic:pic>
+              </a:graphicData>
+            </a:graphic>
+          </wp:inline>
+        </w:drawing>
+      </w:r>
+    </w:p>
+    <w:p>
+      <w:pPr>
+        <w:rPr>
+          <w:rFonts w:ascii="Times New Roman" w:hAnsi="Times New Roman" w:cs="Times New Roman"/>
+          <w:sz w:val="26"/>
+          <w:szCs w:val="26"/>
+        </w:rPr>
+      </w:pPr>
+      <w:proofErr w:type="gramStart"/>
+      <w:r>
+        <w:rPr>
+          <w:rFonts w:ascii="Times New Roman" w:hAnsi="Times New Roman" w:cs="Times New Roman"/>
+          <w:sz w:val="26"/>
+          <w:szCs w:val="26"/>
+        </w:rPr>
+        <w:t>docker</w:t>
+      </w:r>
+      <w:proofErr w:type="gramEnd"/>
+      <w:r>
+        <w:rPr>
+          <w:rFonts w:ascii="Times New Roman" w:hAnsi="Times New Roman" w:cs="Times New Roman"/>
+          <w:sz w:val="26"/>
+          <w:szCs w:val="26"/>
+        </w:rPr>
+        <w:t xml:space="preserve"> volume prune</w:t>
+      </w:r>
+    </w:p>
+    <w:p>
+      <w:pPr>
+        <w:rPr>
+          <w:rFonts w:ascii="Times New Roman" w:hAnsi="Times New Roman" w:cs="Times New Roman"/>
+          <w:sz w:val="26"/>
+          <w:szCs w:val="26"/>
+        </w:rPr>
+      </w:pPr>
+      <w:r>
+        <w:rPr>
+          <w:rFonts w:ascii="Times New Roman" w:hAnsi="Times New Roman" w:cs="Times New Roman"/>
+          <w:noProof/>
+          <w:sz w:val="26"/>
+          <w:szCs w:val="26"/>
+        </w:rPr>
+        <w:lastRenderedPageBreak/>
+        <w:drawing>
+          <wp:inline distT="0" distB="0" distL="0" distR="0">
+            <wp:extent cx="5943600" cy="1654175"/>
+            <wp:effectExtent l="0" t="0" r="0" b="3175"/>
+            <wp:docPr id="19" name="Picture 19"/>
+            <wp:cNvGraphicFramePr>
+              <a:graphicFrameLocks xmlns:a="http://schemas.openxmlformats.org/drawingml/2006/main" noChangeAspect="1"/>
+            </wp:cNvGraphicFramePr>
+            <a:graphic xmlns:a="http://schemas.openxmlformats.org/drawingml/2006/main">
+              <a:graphicData uri="http://schemas.openxmlformats.org/drawingml/2006/picture">
+                <pic:pic xmlns:pic="http://schemas.openxmlformats.org/drawingml/2006/picture">
+                  <pic:nvPicPr>
+                    <pic:cNvPr id="19" name="91CE097.tmp"/>
+                    <pic:cNvPicPr/>
+                  </pic:nvPicPr>
+                  <pic:blipFill>
+                    <a:blip r:embed="rId20">
+                      <a:extLst>
+                        <a:ext uri="{28A0092B-C50C-407E-A947-70E740481C1C}">
+                          <a14:useLocalDpi xmlns:a14="http://schemas.microsoft.com/office/drawing/2010/main" val="0"/>
+                        </a:ext>
+                      </a:extLst>
+                    </a:blip>
+                    <a:stretch>
+                      <a:fillRect/>
+                    </a:stretch>
+                  </pic:blipFill>
+                  <pic:spPr>
+                    <a:xfrm>
+                      <a:off x="0" y="0"/>
+                      <a:ext cx="5943600" cy="1654175"/>
+                    </a:xfrm>
+                    <a:prstGeom prst="rect">
+                      <a:avLst/>
+                    </a:prstGeom>
+                  </pic:spPr>
+                </pic:pic>
+              </a:graphicData>
+            </a:graphic>
+          </wp:inline>
+        </w:drawing>
+      </w:r>
+    </w:p>
+    <w:p>
+      <w:pPr>
+        <w:rPr>
+          <w:rFonts w:ascii="Times New Roman" w:hAnsi="Times New Roman" w:cs="Times New Roman"/>
+          <w:sz w:val="26"/>
+          <w:szCs w:val="26"/>
+        </w:rPr>
+      </w:pPr>
+      <w:r>
+        <w:rPr>
+          <w:rFonts w:ascii="Times New Roman" w:hAnsi="Times New Roman" w:cs="Times New Roman"/>
+          <w:sz w:val="26"/>
+          <w:szCs w:val="26"/>
+        </w:rPr>
+        <w:t>Docker stats</w:t>
+      </w:r>
+    </w:p>
+    <w:p>
+      <w:pPr>
+        <w:rPr>
+          <w:rFonts w:ascii="Times New Roman" w:hAnsi="Times New Roman" w:cs="Times New Roman"/>
+          <w:sz w:val="26"/>
+          <w:szCs w:val="26"/>
+        </w:rPr>
+      </w:pPr>
+      <w:r>
+        <w:rPr>
+          <w:rFonts w:ascii="Times New Roman" w:hAnsi="Times New Roman" w:cs="Times New Roman"/>
+          <w:noProof/>
+          <w:sz w:val="26"/>
+          <w:szCs w:val="26"/>
+        </w:rPr>
+        <w:drawing>
+          <wp:inline distT="0" distB="0" distL="0" distR="0">
+            <wp:extent cx="5943600" cy="1247140"/>
+            <wp:effectExtent l="0" t="0" r="0" b="0"/>
+            <wp:docPr id="20" name="Picture 20"/>
+            <wp:cNvGraphicFramePr>
+              <a:graphicFrameLocks xmlns:a="http://schemas.openxmlformats.org/drawingml/2006/main" noChangeAspect="1"/>
+            </wp:cNvGraphicFramePr>
+            <a:graphic xmlns:a="http://schemas.openxmlformats.org/drawingml/2006/main">
+              <a:graphicData uri="http://schemas.openxmlformats.org/drawingml/2006/picture">
+                <pic:pic xmlns:pic="http://schemas.openxmlformats.org/drawingml/2006/picture">
+                  <pic:nvPicPr>
+                    <pic:cNvPr id="20" name="91C124D.tmp"/>
+                    <pic:cNvPicPr/>
+                  </pic:nvPicPr>
+                  <pic:blipFill>
+                    <a:blip r:embed="rId21">
+                      <a:extLst>
+                        <a:ext uri="{28A0092B-C50C-407E-A947-70E740481C1C}">
+                          <a14:useLocalDpi xmlns:a14="http://schemas.microsoft.com/office/drawing/2010/main" val="0"/>
+                        </a:ext>
+                      </a:extLst>
+                    </a:blip>
+                    <a:stretch>
+                      <a:fillRect/>
+                    </a:stretch>
+                  </pic:blipFill>
+                  <pic:spPr>
+                    <a:xfrm>
+                      <a:off x="0" y="0"/>
+                      <a:ext cx="5943600" cy="1247140"/>
+                    </a:xfrm>
+                    <a:prstGeom prst="rect">
+                      <a:avLst/>
+                    </a:prstGeom>
+                  </pic:spPr>
+                </pic:pic>
+              </a:graphicData>
+            </a:graphic>
+          </wp:inline>
+        </w:drawing>
+      </w:r>
+    </w:p>
+    <w:p>
+      <w:pPr>
+        <w:rPr>
+          <w:rFonts w:ascii="Times New Roman" w:hAnsi="Times New Roman" w:cs="Times New Roman"/>
+          <w:sz w:val="26"/>
+          <w:szCs w:val="26"/>
+        </w:rPr>
+      </w:pPr>
+      <w:proofErr w:type="gramStart"/>
+      <w:r>
+        <w:rPr>
+          <w:rFonts w:ascii="Times New Roman" w:hAnsi="Times New Roman" w:cs="Times New Roman"/>
+          <w:sz w:val="26"/>
+          <w:szCs w:val="26"/>
+        </w:rPr>
+        <w:t>docker</w:t>
+      </w:r>
+      <w:proofErr w:type="gramEnd"/>
+      <w:r>
+        <w:rPr>
+          <w:rFonts w:ascii="Times New Roman" w:hAnsi="Times New Roman" w:cs="Times New Roman"/>
+          <w:sz w:val="26"/>
+          <w:szCs w:val="26"/>
+        </w:rPr>
+        <w:t xml:space="preserve"> network ls</w:t>
+      </w:r>
+    </w:p>
+    <w:p>
+      <w:pPr>
+        <w:rPr>
+          <w:rFonts w:ascii="Times New Roman" w:hAnsi="Times New Roman" w:cs="Times New Roman"/>
+          <w:sz w:val="26"/>
+          <w:szCs w:val="26"/>
+        </w:rPr>
+      </w:pPr>
+      <w:r>
+        <w:rPr>
+          <w:rFonts w:ascii="Times New Roman" w:hAnsi="Times New Roman" w:cs="Times New Roman"/>
+          <w:noProof/>
+          <w:sz w:val="26"/>
+          <w:szCs w:val="26"/>
+        </w:rPr>
+        <w:drawing>
+          <wp:inline distT="0" distB="0" distL="0" distR="0">
+            <wp:extent cx="5943600" cy="1701800"/>
+            <wp:effectExtent l="0" t="0" r="0" b="0"/>
+            <wp:docPr id="21" name="Picture 21"/>
+            <wp:cNvGraphicFramePr>
+              <a:graphicFrameLocks xmlns:a="http://schemas.openxmlformats.org/drawingml/2006/main" noChangeAspect="1"/>
+            </wp:cNvGraphicFramePr>
+            <a:graphic xmlns:a="http://schemas.openxmlformats.org/drawingml/2006/main">
+              <a:graphicData uri="http://schemas.openxmlformats.org/drawingml/2006/picture">
+                <pic:pic xmlns:pic="http://schemas.openxmlformats.org/drawingml/2006/picture">
+                  <pic:nvPicPr>
+                    <pic:cNvPr id="21" name="91C85C9.tmp"/>
+                    <pic:cNvPicPr/>
+                  </pic:nvPicPr>
+                  <pic:blipFill>
+                    <a:blip r:embed="rId22">
+                      <a:extLst>
+                        <a:ext uri="{28A0092B-C50C-407E-A947-70E740481C1C}">
+                          <a14:useLocalDpi xmlns:a14="http://schemas.microsoft.com/office/drawing/2010/main" val="0"/>
+                        </a:ext>
+                      </a:extLst>
+                    </a:blip>
+                    <a:stretch>
+                      <a:fillRect/>
+                    </a:stretch>
+                  </pic:blipFill>
+                  <pic:spPr>
+                    <a:xfrm>
+                      <a:off x="0" y="0"/>
+                      <a:ext cx="5943600" cy="1701800"/>
+                    </a:xfrm>
+                    <a:prstGeom prst="rect">
+                      <a:avLst/>
+                    </a:prstGeom>
+                  </pic:spPr>
+                </pic:pic>
+              </a:graphicData>
+            </a:graphic>
+          </wp:inline>
+        </w:drawing>
+      </w:r>
+    </w:p>
+    <w:p>
+      <w:pPr>
+        <w:rPr>
+          <w:rFonts w:ascii="Times New Roman" w:hAnsi="Times New Roman" w:cs="Times New Roman"/>
+          <w:sz w:val="26"/>
+          <w:szCs w:val="26"/>
+        </w:rPr>
+      </w:pPr>
+      <w:proofErr w:type="gramStart"/>
+      <w:r>
+        <w:rPr>
+          <w:rFonts w:ascii="Times New Roman" w:hAnsi="Times New Roman" w:cs="Times New Roman"/>
+          <w:sz w:val="26"/>
+          <w:szCs w:val="26"/>
+        </w:rPr>
+        <w:t>docker</w:t>
+      </w:r>
+      <w:proofErr w:type="gramEnd"/>
+      <w:r>
+        <w:rPr>
+          <w:rFonts w:ascii="Times New Roman" w:hAnsi="Times New Roman" w:cs="Times New Roman"/>
+          <w:sz w:val="26"/>
+          <w:szCs w:val="26"/>
+        </w:rPr>
+        <w:t xml:space="preserve"> network create my_network</w:t>
+      </w:r>
+    </w:p>
+    <w:p>
+      <w:pPr>
+        <w:rPr>
+          <w:rFonts w:ascii="Times New Roman" w:hAnsi="Times New Roman" w:cs="Times New Roman"/>
+          <w:sz w:val="26"/>
+          <w:szCs w:val="26"/>
+        </w:rPr>
+      </w:pPr>
+      <w:r>
+        <w:rPr>
+          <w:rFonts w:ascii="Times New Roman" w:hAnsi="Times New Roman" w:cs="Times New Roman"/>
+          <w:noProof/>
+          <w:sz w:val="26"/>
+          <w:szCs w:val="26"/>
+        </w:rPr>
+        <w:drawing>
+          <wp:inline distT="0" distB="0" distL="0" distR="0">
+            <wp:extent cx="5943600" cy="1005205"/>
+            <wp:effectExtent l="0" t="0" r="0" b="4445"/>
+            <wp:docPr id="22" name="Picture 22"/>
+            <wp:cNvGraphicFramePr>
+              <a:graphicFrameLocks xmlns:a="http://schemas.openxmlformats.org/drawingml/2006/main" noChangeAspect="1"/>
+            </wp:cNvGraphicFramePr>
+            <a:graphic xmlns:a="http://schemas.openxmlformats.org/drawingml/2006/main">
+              <a:graphicData uri="http://schemas.openxmlformats.org/drawingml/2006/picture">
+                <pic:pic xmlns:pic="http://schemas.openxmlformats.org/drawingml/2006/picture">
+                  <pic:nvPicPr>
+                    <pic:cNvPr id="22" name="91C9805.tmp"/>
+                    <pic:cNvPicPr/>
+                  </pic:nvPicPr>
+                  <pic:blipFill>
+                    <a:blip r:embed="rId23">
+                      <a:extLst>
+                        <a:ext uri="{28A0092B-C50C-407E-A947-70E740481C1C}">
+                          <a14:useLocalDpi xmlns:a14="http://schemas.microsoft.com/office/drawing/2010/main" val="0"/>
+                        </a:ext>
+                      </a:extLst>
+                    </a:blip>
+                    <a:stretch>
+                      <a:fillRect/>
+                    </a:stretch>
+                  </pic:blipFill>
+                  <pic:spPr>
+                    <a:xfrm>
+                      <a:off x="0" y="0"/>
+                      <a:ext cx="5943600" cy="1005205"/>
+                    </a:xfrm>
+                    <a:prstGeom prst="rect">
+                      <a:avLst/>
+                    </a:prstGeom>
+                  </pic:spPr>
+                </pic:pic>
+              </a:graphicData>
+            </a:graphic>
+          </wp:inline>
+        </w:drawing>
+      </w:r>
+    </w:p>
+    <w:p>
+      <w:pPr>
+        <w:rPr>
+          <w:rFonts w:ascii="Times New Roman" w:hAnsi="Times New Roman" w:cs="Times New Roman"/>
+          <w:sz w:val="26"/>
+          <w:szCs w:val="26"/>
+        </w:rPr>
+      </w:pPr>
+      <w:proofErr w:type="gramStart"/>
+      <w:r>
+        <w:rPr>
+          <w:rFonts w:ascii="Times New Roman" w:hAnsi="Times New Roman" w:cs="Times New Roman"/>
+          <w:sz w:val="26"/>
+          <w:szCs w:val="26"/>
+        </w:rPr>
+        <w:t>docker</w:t>
+      </w:r>
+      <w:proofErr w:type="gramEnd"/>
+      <w:r>
+        <w:rPr>
+          <w:rFonts w:ascii="Times New Roman" w:hAnsi="Times New Roman" w:cs="Times New Roman"/>
+          <w:sz w:val="26"/>
+          <w:szCs w:val="26"/>
+        </w:rPr>
+        <w:t xml:space="preserve"> run -d --network my_network --name my_container nginx</w:t>
+      </w:r>
+    </w:p>
+    <w:p>
+      <w:pPr>
+        <w:rPr>
+          <w:rFonts w:ascii="Times New Roman" w:hAnsi="Times New Roman" w:cs="Times New Roman"/>
+          <w:sz w:val="26"/>
+          <w:szCs w:val="26"/>
+        </w:rPr>
+      </w:pPr>
+      <w:r>
+        <w:rPr>
+          <w:rFonts w:ascii="Times New Roman" w:hAnsi="Times New Roman" w:cs="Times New Roman"/>
+          <w:noProof/>
+          <w:sz w:val="26"/>
+          <w:szCs w:val="26"/>
+        </w:rPr>
+        <w:drawing>
+          <wp:inline distT="0" distB="0" distL="0" distR="0">
+            <wp:extent cx="5943600" cy="843280"/>
+            <wp:effectExtent l="0" t="0" r="0" b="0"/>
+            <wp:docPr id="23" name="Picture 23"/>
+            <wp:cNvGraphicFramePr>
+              <a:graphicFrameLocks xmlns:a="http://schemas.openxmlformats.org/drawingml/2006/main" noChangeAspect="1"/>
+            </wp:cNvGraphicFramePr>
+            <a:graphic xmlns:a="http://schemas.openxmlformats.org/drawingml/2006/main">
+              <a:graphicData uri="http://schemas.openxmlformats.org/drawingml/2006/picture">
+                <pic:pic xmlns:pic="http://schemas.openxmlformats.org/drawingml/2006/picture">
+                  <pic:nvPicPr>
+                    <pic:cNvPr id="23" name="91C53D4.tmp"/>
+                    <pic:cNvPicPr/>
+                  </pic:nvPicPr>
+                  <pic:blipFill>
+                    <a:blip r:embed="rId24">
+                      <a:extLst>
+                        <a:ext uri="{28A0092B-C50C-407E-A947-70E740481C1C}">
+                          <a14:useLocalDpi xmlns:a14="http://schemas.microsoft.com/office/drawing/2010/main" val="0"/>
+                        </a:ext>
+                      </a:extLst>
+                    </a:blip>
+                    <a:stretch>
+                      <a:fillRect/>
+                    </a:stretch>
+                  </pic:blipFill>
+                  <pic:spPr>
+                    <a:xfrm>
+                      <a:off x="0" y="0"/>
+                      <a:ext cx="5943600" cy="843280"/>
+                    </a:xfrm>
+                    <a:prstGeom prst="rect">
+                      <a:avLst/>
+                    </a:prstGeom>
+                  </pic:spPr>
+                </pic:pic>
+              </a:graphicData>
+            </a:graphic>
+          </wp:inline>
+        </w:drawing>
+      </w:r>
+    </w:p>
+    <w:p>
+      <w:pPr>
+        <w:rPr>
+          <w:rFonts w:ascii="Times New Roman" w:hAnsi="Times New Roman" w:cs="Times New Roman"/>
+          <w:sz w:val="26"/>
+          <w:szCs w:val="26"/>
+        </w:rPr>
+      </w:pPr>
+      <w:proofErr w:type="gramStart"/>
+      <w:r>
+        <w:rPr>
+          <w:rFonts w:ascii="Times New Roman" w:hAnsi="Times New Roman" w:cs="Times New Roman"/>
+          <w:sz w:val="26"/>
+          <w:szCs w:val="26"/>
+        </w:rPr>
+        <w:lastRenderedPageBreak/>
+        <w:t>docker</w:t>
+      </w:r>
+      <w:proofErr w:type="gramEnd"/>
+      <w:r>
+        <w:rPr>
+          <w:rFonts w:ascii="Times New Roman" w:hAnsi="Times New Roman" w:cs="Times New Roman"/>
+          <w:sz w:val="26"/>
+          <w:szCs w:val="26"/>
+        </w:rPr>
+        <w:t xml:space="preserve"> network connect my_network my_nginx</w:t>
+      </w:r>
+    </w:p>
+    <w:p>
+      <w:pPr>
+        <w:rPr>
+          <w:rFonts w:ascii="Times New Roman" w:hAnsi="Times New Roman" w:cs="Times New Roman"/>
+          <w:sz w:val="26"/>
+          <w:szCs w:val="26"/>
+        </w:rPr>
+      </w:pPr>
+      <w:r>
+        <w:rPr>
+          <w:rFonts w:ascii="Times New Roman" w:hAnsi="Times New Roman" w:cs="Times New Roman"/>
+          <w:noProof/>
+          <w:sz w:val="26"/>
+          <w:szCs w:val="26"/>
+        </w:rPr>
+        <w:drawing>
+          <wp:inline distT="0" distB="0" distL="0" distR="0">
+            <wp:extent cx="5943600" cy="1054100"/>
+            <wp:effectExtent l="0" t="0" r="0" b="0"/>
+            <wp:docPr id="24" name="Picture 24"/>
+            <wp:cNvGraphicFramePr>
+              <a:graphicFrameLocks xmlns:a="http://schemas.openxmlformats.org/drawingml/2006/main" noChangeAspect="1"/>
+            </wp:cNvGraphicFramePr>
+            <a:graphic xmlns:a="http://schemas.openxmlformats.org/drawingml/2006/main">
+              <a:graphicData uri="http://schemas.openxmlformats.org/drawingml/2006/picture">
+                <pic:pic xmlns:pic="http://schemas.openxmlformats.org/drawingml/2006/picture">
+                  <pic:nvPicPr>
+                    <pic:cNvPr id="24" name="91CFD.tmp"/>
+                    <pic:cNvPicPr/>
+                  </pic:nvPicPr>
+                  <pic:blipFill>
+                    <a:blip r:embed="rId25">
+                      <a:extLst>
+                        <a:ext uri="{28A0092B-C50C-407E-A947-70E740481C1C}">
+                          <a14:useLocalDpi xmlns:a14="http://schemas.microsoft.com/office/drawing/2010/main" val="0"/>
+                        </a:ext>
+                      </a:extLst>
+                    </a:blip>
+                    <a:stretch>
+                      <a:fillRect/>
+                    </a:stretch>
+                  </pic:blipFill>
+                  <pic:spPr>
+                    <a:xfrm>
+                      <a:off x="0" y="0"/>
+                      <a:ext cx="5943600" cy="1054100"/>
+                    </a:xfrm>
+                    <a:prstGeom prst="rect">
+                      <a:avLst/>
+                    </a:prstGeom>
+                  </pic:spPr>
+                </pic:pic>
+              </a:graphicData>
+            </a:graphic>
+          </wp:inline>
+        </w:drawing>
+      </w:r>
+    </w:p>
+    <w:p>
+      <w:pPr>
+        <w:rPr>
+          <w:rFonts w:ascii="Times New Roman" w:hAnsi="Times New Roman" w:cs="Times New Roman"/>
+          <w:sz w:val="26"/>
+          <w:szCs w:val="26"/>
+        </w:rPr>
+      </w:pPr>
+      <w:proofErr w:type="gramStart"/>
+      <w:r>
+        <w:rPr>
+          <w:rFonts w:ascii="Times New Roman" w:hAnsi="Times New Roman" w:cs="Times New Roman"/>
+          <w:sz w:val="26"/>
+          <w:szCs w:val="26"/>
+        </w:rPr>
+        <w:t>docker</w:t>
+      </w:r>
+      <w:proofErr w:type="gramEnd"/>
+      <w:r>
+        <w:rPr>
+          <w:rFonts w:ascii="Times New Roman" w:hAnsi="Times New Roman" w:cs="Times New Roman"/>
+          <w:sz w:val="26"/>
+          <w:szCs w:val="26"/>
+        </w:rPr>
+        <w:t xml:space="preserve"> run -d -e MY_ENV=hello_world nginx</w:t>
+      </w:r>
+    </w:p>
+    <w:p>
+      <w:pPr>
+        <w:rPr>
+          <w:rFonts w:ascii="Times New Roman" w:hAnsi="Times New Roman" w:cs="Times New Roman"/>
+          <w:sz w:val="26"/>
+          <w:szCs w:val="26"/>
+        </w:rPr>
+      </w:pPr>
+      <w:r>
+        <w:rPr>
+          <w:rFonts w:ascii="Times New Roman" w:hAnsi="Times New Roman" w:cs="Times New Roman"/>
+          <w:noProof/>
+          <w:sz w:val="26"/>
+          <w:szCs w:val="26"/>
+        </w:rPr>
+        <w:drawing>
+          <wp:inline distT="0" distB="0" distL="0" distR="0">
+            <wp:extent cx="5943600" cy="1306830"/>
+            <wp:effectExtent l="0" t="0" r="0" b="7620"/>
+            <wp:docPr id="25" name="Picture 25"/>
+            <wp:cNvGraphicFramePr>
+              <a:graphicFrameLocks xmlns:a="http://schemas.openxmlformats.org/drawingml/2006/main" noChangeAspect="1"/>
+            </wp:cNvGraphicFramePr>
+            <a:graphic xmlns:a="http://schemas.openxmlformats.org/drawingml/2006/main">
+              <a:graphicData uri="http://schemas.openxmlformats.org/drawingml/2006/picture">
+                <pic:pic xmlns:pic="http://schemas.openxmlformats.org/drawingml/2006/picture">
+                  <pic:nvPicPr>
+                    <pic:cNvPr id="25" name="91C73EC.tmp"/>
+                    <pic:cNvPicPr/>
+                  </pic:nvPicPr>
+                  <pic:blipFill>
+                    <a:blip r:embed="rId26">
+                      <a:extLst>
+                        <a:ext uri="{28A0092B-C50C-407E-A947-70E740481C1C}">
+                          <a14:useLocalDpi xmlns:a14="http://schemas.microsoft.com/office/drawing/2010/main" val="0"/>
+                        </a:ext>
+                      </a:extLst>
+                    </a:blip>
+                    <a:stretch>
+                      <a:fillRect/>
+                    </a:stretch>
+                  </pic:blipFill>
+                  <pic:spPr>
+                    <a:xfrm>
+                      <a:off x="0" y="0"/>
+                      <a:ext cx="5943600" cy="1306830"/>
+                    </a:xfrm>
+                    <a:prstGeom prst="rect">
+                      <a:avLst/>
+                    </a:prstGeom>
+                  </pic:spPr>
+                </pic:pic>
+              </a:graphicData>
+            </a:graphic>
+          </wp:inline>
+        </w:drawing>
+      </w:r>
+    </w:p>
+    <w:p>
+      <w:pPr>
+        <w:rPr>
+          <w:rFonts w:ascii="Times New Roman" w:hAnsi="Times New Roman" w:cs="Times New Roman"/>
+          <w:sz w:val="26"/>
+          <w:szCs w:val="26"/>
+        </w:rPr>
+      </w:pPr>
+      <w:proofErr w:type="gramStart"/>
+      <w:r>
+        <w:rPr>
+          <w:rFonts w:ascii="Times New Roman" w:hAnsi="Times New Roman" w:cs="Times New Roman"/>
+          <w:sz w:val="26"/>
+          <w:szCs w:val="26"/>
+        </w:rPr>
+        <w:t>docker</w:t>
+      </w:r>
+      <w:proofErr w:type="gramEnd"/>
+      <w:r>
+        <w:rPr>
+          <w:rFonts w:ascii="Times New Roman" w:hAnsi="Times New Roman" w:cs="Times New Roman"/>
+          <w:sz w:val="26"/>
+          <w:szCs w:val="26"/>
+        </w:rPr>
+        <w:t xml:space="preserve"> logs -f my_nginx</w:t>
+      </w:r>
+    </w:p>
+    <w:p>
+      <w:pPr>
+        <w:rPr>
+          <w:rFonts w:ascii="Times New Roman" w:hAnsi="Times New Roman" w:cs="Times New Roman"/>
+          <w:sz w:val="26"/>
+          <w:szCs w:val="26"/>
+        </w:rPr>
+      </w:pPr>
+      <w:r>
+        <w:rPr>
+          <w:rFonts w:ascii="Times New Roman" w:hAnsi="Times New Roman" w:cs="Times New Roman"/>
+          <w:noProof/>
+          <w:sz w:val="26"/>
+          <w:szCs w:val="26"/>
+        </w:rPr>
+        <w:drawing>
+          <wp:inline distT="0" distB="0" distL="0" distR="0">
+            <wp:extent cx="5943600" cy="3112135"/>
+            <wp:effectExtent l="0" t="0" r="0" b="0"/>
+            <wp:docPr id="27" name="Picture 27"/>
+            <wp:cNvGraphicFramePr>
+              <a:graphicFrameLocks xmlns:a="http://schemas.openxmlformats.org/drawingml/2006/main" noChangeAspect="1"/>
+            </wp:cNvGraphicFramePr>
+            <a:graphic xmlns:a="http://schemas.openxmlformats.org/drawingml/2006/main">
+              <a:graphicData uri="http://schemas.openxmlformats.org/drawingml/2006/picture">
+                <pic:pic xmlns:pic="http://schemas.openxmlformats.org/drawingml/2006/picture">
+                  <pic:nvPicPr>
+                    <pic:cNvPr id="27" name="91C1260.tmp"/>
+                    <pic:cNvPicPr/>
+                  </pic:nvPicPr>
+                  <pic:blipFill>
+                    <a:blip r:embed="rId27">
+                      <a:extLst>
+                        <a:ext uri="{28A0092B-C50C-407E-A947-70E740481C1C}">
+                          <a14:useLocalDpi xmlns:a14="http://schemas.microsoft.com/office/drawing/2010/main" val="0"/>
+                        </a:ext>
+                      </a:extLst>
+                    </a:blip>
+                    <a:stretch>
+                      <a:fillRect/>
+                    </a:stretch>
+                  </pic:blipFill>
+                  <pic:spPr>
+                    <a:xfrm>
+                      <a:off x="0" y="0"/>
+                      <a:ext cx="5943600" cy="3112135"/>
+                    </a:xfrm>
+                    <a:prstGeom prst="rect">
+                      <a:avLst/>
+                    </a:prstGeom>
+                  </pic:spPr>
+                </pic:pic>
+              </a:graphicData>
+            </a:graphic>
+          </wp:inline>
+        </w:drawing>
+      </w:r>
+    </w:p>
+    <w:p>
+      <w:pPr>
+        <w:rPr>
+          <w:rFonts w:ascii="Times New Roman" w:hAnsi="Times New Roman" w:cs="Times New Roman"/>
+          <w:sz w:val="26"/>
+          <w:szCs w:val="26"/>
+        </w:rPr>
+      </w:pPr>
+      <w:r>
+        <w:rPr>
+          <w:rFonts w:ascii="Times New Roman" w:hAnsi="Times New Roman" w:cs="Times New Roman"/>
+          <w:noProof/>
+          <w:sz w:val="26"/>
+          <w:szCs w:val="26"/>
+        </w:rPr>
+        <w:lastRenderedPageBreak/>
+        <w:drawing>
+          <wp:inline distT="0" distB="0" distL="0" distR="0">
+            <wp:extent cx="5943600" cy="3341370"/>
+            <wp:effectExtent l="0" t="0" r="0" b="0"/>
+            <wp:docPr id="28" name="Picture 28"/>
+            <wp:cNvGraphicFramePr>
+              <a:graphicFrameLocks xmlns:a="http://schemas.openxmlformats.org/drawingml/2006/main" noChangeAspect="1"/>
+            </wp:cNvGraphicFramePr>
+            <a:graphic xmlns:a="http://schemas.openxmlformats.org/drawingml/2006/main">
+              <a:graphicData uri="http://schemas.openxmlformats.org/drawingml/2006/picture">
+                <pic:pic xmlns:pic="http://schemas.openxmlformats.org/drawingml/2006/picture">
+                  <pic:nvPicPr>
+                    <pic:cNvPr id="28" name="91C8EDC.tmp"/>
+                    <pic:cNvPicPr/>
+                  </pic:nvPicPr>
+                  <pic:blipFill>
+                    <a:blip r:embed="rId28" cstate="print">
+                      <a:extLst>
+                        <a:ext uri="{28A0092B-C50C-407E-A947-70E740481C1C}">
+                          <a14:useLocalDpi xmlns:a14="http://schemas.microsoft.com/office/drawing/2010/main" val="0"/>
+                        </a:ext>
+                      </a:extLst>
+                    </a:blip>
+                    <a:stretch>
+                      <a:fillRect/>
+                    </a:stretch>
+                  </pic:blipFill>
+                  <pic:spPr>
+                    <a:xfrm>
+                      <a:off x="0" y="0"/>
+                      <a:ext cx="5943600" cy="3341370"/>
+                    </a:xfrm>
+                    <a:prstGeom prst="rect">
+                      <a:avLst/>
+                    </a:prstGeom>
+                  </pic:spPr>
+                </pic:pic>
+              </a:graphicData>
+            </a:graphic>
+          </wp:inline>
+        </w:drawing>
+      </w:r>
+    </w:p>
+    <w:p>
+      <w:pPr>
+        <w:rPr>
+          <w:rFonts w:ascii="Times New Roman" w:hAnsi="Times New Roman" w:cs="Times New Roman"/>
+          <w:sz w:val="26"/>
+          <w:szCs w:val="26"/>
+        </w:rPr>
+      </w:pPr>
+      <w:proofErr w:type="gramStart"/>
+      <w:r>
+        <w:rPr>
+          <w:rFonts w:ascii="Times New Roman" w:hAnsi="Times New Roman" w:cs="Times New Roman"/>
+          <w:sz w:val="26"/>
+          <w:szCs w:val="26"/>
+        </w:rPr>
+        <w:t>docker</w:t>
+      </w:r>
+      <w:proofErr w:type="gramEnd"/>
+      <w:r>
+        <w:rPr>
+          <w:rFonts w:ascii="Times New Roman" w:hAnsi="Times New Roman" w:cs="Times New Roman"/>
+          <w:sz w:val="26"/>
+          <w:szCs w:val="26"/>
+        </w:rPr>
+        <w:t xml:space="preserve"> build -t my_nginx_image .</w:t>
+      </w:r>
+    </w:p>
+    <w:p>
+      <w:pPr>
+        <w:rPr>
+          <w:rFonts w:ascii="Times New Roman" w:hAnsi="Times New Roman" w:cs="Times New Roman"/>
+          <w:sz w:val="26"/>
+          <w:szCs w:val="26"/>
+        </w:rPr>
+      </w:pPr>
       <w:bookmarkStart w:id="0" w:name="_GoBack"/>
+      <w:r>
+        <w:rPr>
+          <w:rFonts w:ascii="Times New Roman" w:hAnsi="Times New Roman" w:cs="Times New Roman"/>
+          <w:noProof/>
+          <w:sz w:val="26"/>
+          <w:szCs w:val="26"/>
+        </w:rPr>
+        <w:drawing>
+          <wp:inline distT="0" distB="0" distL="0" distR="0">
+            <wp:extent cx="5943600" cy="3272155"/>
+            <wp:effectExtent l="0" t="0" r="0" b="4445"/>
+            <wp:docPr id="29" name="Picture 29"/>
+            <wp:cNvGraphicFramePr>
+              <a:graphicFrameLocks xmlns:a="http://schemas.openxmlformats.org/drawingml/2006/main" noChangeAspect="1"/>
+            </wp:cNvGraphicFramePr>
+            <a:graphic xmlns:a="http://schemas.openxmlformats.org/drawingml/2006/main">
+              <a:graphicData uri="http://schemas.openxmlformats.org/drawingml/2006/picture">
+                <pic:pic xmlns:pic="http://schemas.openxmlformats.org/drawingml/2006/picture">
+                  <pic:nvPicPr>
+                    <pic:cNvPr id="29" name="91CED54.tmp"/>
+                    <pic:cNvPicPr/>
+                  </pic:nvPicPr>
+                  <pic:blipFill>
+                    <a:blip r:embed="rId29">
+                      <a:extLst>
+                        <a:ext uri="{28A0092B-C50C-407E-A947-70E740481C1C}">
+                          <a14:useLocalDpi xmlns:a14="http://schemas.microsoft.com/office/drawing/2010/main" val="0"/>
+                        </a:ext>
+                      </a:extLst>
+                    </a:blip>
+                    <a:stretch>
+                      <a:fillRect/>
+                    </a:stretch>
+                  </pic:blipFill>
+                  <pic:spPr>
+                    <a:xfrm>
+                      <a:off x="0" y="0"/>
+                      <a:ext cx="5943600" cy="3272155"/>
+                    </a:xfrm>
+                    <a:prstGeom prst="rect">
+                      <a:avLst/>
+                    </a:prstGeom>
+                  </pic:spPr>
+                </pic:pic>
+              </a:graphicData>
+            </a:graphic>
+          </wp:inline>
+        </w:drawing>
+      </w:r>
       <w:bookmarkEnd w:id="0"/>
+    </w:p>
+    <w:p>
+      <w:pPr>
+        <w:rPr>
+          <w:rFonts w:ascii="Times New Roman" w:hAnsi="Times New Roman" w:cs="Times New Roman"/>
+          <w:sz w:val="26"/>
+          <w:szCs w:val="26"/>
+        </w:rPr>
+      </w:pPr>
     </w:p>
     <w:sectPr>
       <w:pgSz w:w="12240" w:h="15840"/>

</xml_diff>